<commit_message>
#Se corrigen las descripciones de los casos de uso
</commit_message>
<xml_diff>
--- a/Descripcion-UC/Descripcion-UC001.1.docx
+++ b/Descripcion-UC/Descripcion-UC001.1.docx
@@ -419,7 +419,7 @@
                 </mc:Choice>
                 <mc:Fallback>
                   <w:pict>
-                    <v:rect id="Forma5" o:spid="_x0000_s1026" o:spt="1" style="position:absolute;left:0pt;margin-left:33.45pt;margin-top:3.65pt;height:7.15pt;width:10.65pt;z-index:251659264;mso-width-relative:page;mso-height-relative:page;" fillcolor="#FFFFFF" filled="t" stroked="t" coordsize="21600,21600" o:gfxdata="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">
+                    <v:rect id="Forma5" o:spid="_x0000_s1026" o:spt="1" style="position:absolute;left:0pt;margin-left:33.45pt;margin-top:3.65pt;height:7.15pt;width:10.65pt;z-index:251659264;mso-width-relative:page;mso-height-relative:page;" fillcolor="#FFFFFF" filled="t" stroked="t" coordsize="21600,21600" o:gfxdata="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">
                       <v:fill on="t" focussize="0,0"/>
                       <v:stroke weight="0.992125984251969pt" color="#000000" joinstyle="round" dashstyle="dash" endcap="round"/>
                       <v:imagedata o:title=""/>
@@ -510,7 +510,7 @@
                 </mc:Choice>
                 <mc:Fallback>
                   <w:pict>
-                    <v:rect id="Forma6" o:spid="_x0000_s1026" o:spt="1" style="position:absolute;left:0pt;margin-left:26.75pt;margin-top:4.3pt;height:7.15pt;width:10.65pt;z-index:251659264;mso-width-relative:page;mso-height-relative:page;" fillcolor="#000000" filled="t" stroked="t" coordsize="21600,21600" o:gfxdata="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">
+                    <v:rect id="Forma6" o:spid="_x0000_s1026" o:spt="1" style="position:absolute;left:0pt;margin-left:26.75pt;margin-top:4.3pt;height:7.15pt;width:10.65pt;z-index:251659264;mso-width-relative:page;mso-height-relative:page;" fillcolor="#000000" filled="t" stroked="t" coordsize="21600,21600" o:gfxdata="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">
                       <v:fill on="t" focussize="0,0"/>
                       <v:stroke weight="0.992125984251969pt" color="#000000" joinstyle="round" dashstyle="dash"/>
                       <v:imagedata o:title=""/>
@@ -1333,6 +1333,7 @@
             <w:pPr>
               <w:widowControl w:val="0"/>
               <w:numPr>
+                <w:ilvl w:val="0"/>
                 <w:numId w:val="0"/>
               </w:numPr>
               <w:spacing w:after="0" w:line="240" w:lineRule="auto"/>
@@ -1347,6 +1348,7 @@
             <w:pPr>
               <w:widowControl w:val="0"/>
               <w:numPr>
+                <w:ilvl w:val="0"/>
                 <w:numId w:val="0"/>
               </w:numPr>
               <w:spacing w:after="0" w:line="240" w:lineRule="auto"/>
@@ -1361,6 +1363,7 @@
             <w:pPr>
               <w:widowControl w:val="0"/>
               <w:numPr>
+                <w:ilvl w:val="0"/>
                 <w:numId w:val="0"/>
               </w:numPr>
               <w:spacing w:after="0" w:line="240" w:lineRule="auto"/>
@@ -1375,6 +1378,7 @@
             <w:pPr>
               <w:widowControl w:val="0"/>
               <w:numPr>
+                <w:ilvl w:val="0"/>
                 <w:numId w:val="0"/>
               </w:numPr>
               <w:spacing w:after="0" w:line="240" w:lineRule="auto"/>
@@ -1389,6 +1393,7 @@
             <w:pPr>
               <w:widowControl w:val="0"/>
               <w:numPr>
+                <w:ilvl w:val="0"/>
                 <w:numId w:val="0"/>
               </w:numPr>
               <w:spacing w:after="0" w:line="240" w:lineRule="auto"/>
@@ -1427,6 +1432,7 @@
             <w:pPr>
               <w:widowControl w:val="0"/>
               <w:numPr>
+                <w:ilvl w:val="0"/>
                 <w:numId w:val="0"/>
               </w:numPr>
               <w:spacing w:after="0" w:line="240" w:lineRule="auto"/>
@@ -1441,6 +1447,7 @@
             <w:pPr>
               <w:widowControl w:val="0"/>
               <w:numPr>
+                <w:ilvl w:val="0"/>
                 <w:numId w:val="0"/>
               </w:numPr>
               <w:spacing w:after="0" w:line="240" w:lineRule="auto"/>
@@ -1455,6 +1462,7 @@
             <w:pPr>
               <w:widowControl w:val="0"/>
               <w:numPr>
+                <w:ilvl w:val="0"/>
                 <w:numId w:val="0"/>
               </w:numPr>
               <w:spacing w:after="0" w:line="240" w:lineRule="auto"/>
@@ -1524,6 +1532,7 @@
             <w:pPr>
               <w:widowControl w:val="0"/>
               <w:numPr>
+                <w:ilvl w:val="0"/>
                 <w:numId w:val="0"/>
               </w:numPr>
               <w:spacing w:after="0" w:line="240" w:lineRule="auto"/>
@@ -1738,17 +1747,7 @@
                 <w:sz w:val="21"/>
                 <w:szCs w:val="21"/>
               </w:rPr>
-              <w:t>4.1.</w:t>
-            </w:r>
-            <w:bookmarkStart w:id="0" w:name="_GoBack"/>
-            <w:bookmarkEnd w:id="0"/>
-            <w:r>
-              <w:rPr>
-                <w:rFonts w:hint="default" w:ascii="Calibri" w:hAnsi="Calibri" w:eastAsia="SimSun" w:cs="Calibri"/>
-                <w:sz w:val="21"/>
-                <w:szCs w:val="21"/>
-              </w:rPr>
-              <w:t>3 Fin del caso de uso.</w:t>
+              <w:t>4.1.3 Fin del caso de uso.</w:t>
             </w:r>
           </w:p>
         </w:tc>
@@ -1777,19 +1776,20 @@
             <w:pPr>
               <w:widowControl w:val="0"/>
               <w:spacing w:after="0"/>
-            </w:pPr>
-            <w:r>
-              <w:t xml:space="preserve">Asociaciones de extensión: </w:t>
-            </w:r>
-            <w:r>
               <w:rPr>
                 <w:rFonts w:hint="default"/>
                 <w:lang w:val="es-MX"/>
               </w:rPr>
-              <w:t>N</w:t>
-            </w:r>
-            <w:r>
-              <w:t>o aplica</w:t>
+            </w:pPr>
+            <w:r>
+              <w:t xml:space="preserve">Asociaciones de extensión: </w:t>
+            </w:r>
+            <w:r>
+              <w:rPr>
+                <w:rFonts w:hint="default"/>
+                <w:lang w:val="es-MX"/>
+              </w:rPr>
+              <w:t>No aplica</w:t>
             </w:r>
           </w:p>
         </w:tc>
@@ -1818,51 +1818,22 @@
             <w:pPr>
               <w:widowControl w:val="0"/>
               <w:spacing w:after="0"/>
+              <w:rPr>
+                <w:rFonts w:hint="default"/>
+                <w:lang w:val="es-MX"/>
+              </w:rPr>
             </w:pPr>
             <w:r>
               <w:t xml:space="preserve">Asociaciones de inclusión: </w:t>
             </w:r>
             <w:r>
               <w:rPr>
-                <w:rFonts w:hint="default" w:ascii="Calibri" w:hAnsi="Calibri" w:eastAsia="SimSun" w:cs="Calibri"/>
-                <w:sz w:val="21"/>
-                <w:szCs w:val="21"/>
-              </w:rPr>
-              <w:t>Validar credenciales</w:t>
-            </w:r>
-            <w:r>
-              <w:rPr>
-                <w:rFonts w:hint="default" w:ascii="Calibri" w:hAnsi="Calibri" w:eastAsia="SimSun" w:cs="Calibri"/>
+                <w:rFonts w:hint="default" w:eastAsia="SimSun" w:cs="Calibri"/>
                 <w:sz w:val="21"/>
                 <w:szCs w:val="21"/>
                 <w:lang w:val="es-MX"/>
               </w:rPr>
-              <w:t>,</w:t>
-            </w:r>
-            <w:r>
-              <w:rPr>
-                <w:rFonts w:hint="default" w:ascii="Calibri" w:hAnsi="Calibri" w:eastAsia="SimSun" w:cs="Calibri"/>
-                <w:sz w:val="21"/>
-                <w:szCs w:val="21"/>
-              </w:rPr>
-              <w:t>Verificar estado del usuario</w:t>
-            </w:r>
-            <w:r>
-              <w:rPr>
-                <w:rFonts w:hint="default" w:ascii="Calibri" w:hAnsi="Calibri" w:eastAsia="SimSun" w:cs="Calibri"/>
-                <w:sz w:val="21"/>
-                <w:szCs w:val="21"/>
-                <w:lang w:val="es-MX"/>
-              </w:rPr>
-              <w:t xml:space="preserve"> y </w:t>
-            </w:r>
-            <w:r>
-              <w:rPr>
-                <w:rFonts w:hint="default" w:ascii="Calibri" w:hAnsi="Calibri" w:eastAsia="SimSun" w:cs="Calibri"/>
-                <w:sz w:val="21"/>
-                <w:szCs w:val="21"/>
-              </w:rPr>
-              <w:t>Obtener rol y permisos</w:t>
+              <w:t>No aplica</w:t>
             </w:r>
           </w:p>
         </w:tc>
@@ -1934,17 +1905,14 @@
               <w:spacing w:after="0"/>
             </w:pPr>
             <w:r>
-              <w:t xml:space="preserve">Use case al que extiende: </w:t>
+              <w:t xml:space="preserve">Use case al que extiende:  </w:t>
             </w:r>
             <w:r>
               <w:rPr>
                 <w:rFonts w:hint="default"/>
                 <w:lang w:val="es-MX"/>
               </w:rPr>
-              <w:t>N</w:t>
-            </w:r>
-            <w:r>
-              <w:t>o aplica</w:t>
+              <w:t xml:space="preserve">Consultar usuario - Consultar organización - Consultar sucursal - Consultar cliente - Consultar producto - Consultar categoria - Registrar venta - Consultar solicitud crédito - Generar reporte venta - Generar reporte producto  </w:t>
             </w:r>
           </w:p>
         </w:tc>
@@ -1973,17 +1941,22 @@
             <w:pPr>
               <w:widowControl w:val="0"/>
               <w:spacing w:after="0"/>
+              <w:rPr>
+                <w:rFonts w:hint="default"/>
+                <w:lang w:val="es-MX"/>
+              </w:rPr>
             </w:pPr>
             <w:r>
               <w:t xml:space="preserve">Use case de generalización: </w:t>
             </w:r>
             <w:r>
               <w:rPr>
-                <w:rFonts w:hint="default" w:ascii="Calibri" w:hAnsi="Calibri" w:eastAsia="SimSun" w:cs="Calibri"/>
-                <w:sz w:val="21"/>
-                <w:szCs w:val="21"/>
-              </w:rPr>
-              <w:t>Administración y Seguridad</w:t>
+                <w:rFonts w:hint="default" w:eastAsia="SimSun" w:cs="Calibri"/>
+                <w:sz w:val="21"/>
+                <w:szCs w:val="21"/>
+                <w:lang w:val="es-MX"/>
+              </w:rPr>
+              <w:t>No aplica</w:t>
             </w:r>
           </w:p>
         </w:tc>
@@ -1994,6 +1967,8 @@
       <w:pPr>
         <w:spacing w:line="276" w:lineRule="auto"/>
       </w:pPr>
+      <w:bookmarkStart w:id="0" w:name="_GoBack"/>
+      <w:bookmarkEnd w:id="0"/>
     </w:p>
     <w:sectPr>
       <w:pgSz w:w="11906" w:h="16838"/>
@@ -2134,7 +2109,7 @@
     <w:lsdException w:uiPriority="99" w:name="footnote text"/>
     <w:lsdException w:uiPriority="99" w:name="annotation text"/>
     <w:lsdException w:qFormat="1" w:unhideWhenUsed="0" w:uiPriority="0" w:semiHidden="0" w:name="header"/>
-    <w:lsdException w:unhideWhenUsed="0" w:uiPriority="0" w:semiHidden="0" w:name="footer"/>
+    <w:lsdException w:qFormat="1" w:unhideWhenUsed="0" w:uiPriority="0" w:semiHidden="0" w:name="footer"/>
     <w:lsdException w:uiPriority="99" w:name="index heading"/>
     <w:lsdException w:qFormat="1" w:unhideWhenUsed="0" w:uiPriority="0" w:semiHidden="0" w:name="caption"/>
     <w:lsdException w:uiPriority="99" w:name="table of figures"/>
@@ -2168,7 +2143,7 @@
     <w:lsdException w:uiPriority="99" w:name="Closing"/>
     <w:lsdException w:uiPriority="99" w:name="Signature"/>
     <w:lsdException w:qFormat="1" w:uiPriority="1" w:name="Default Paragraph Font"/>
-    <w:lsdException w:unhideWhenUsed="0" w:uiPriority="0" w:semiHidden="0" w:name="Body Text"/>
+    <w:lsdException w:qFormat="1" w:unhideWhenUsed="0" w:uiPriority="0" w:semiHidden="0" w:name="Body Text"/>
     <w:lsdException w:uiPriority="99" w:name="Body Text Indent"/>
     <w:lsdException w:uiPriority="99" w:name="List Continue"/>
     <w:lsdException w:uiPriority="99" w:name="List Continue 2"/>
@@ -2334,6 +2309,7 @@
   <w:style w:type="paragraph" w:styleId="7">
     <w:name w:val="Body Text"/>
     <w:basedOn w:val="1"/>
+    <w:qFormat/>
     <w:uiPriority w:val="0"/>
     <w:pPr>
       <w:spacing w:after="140" w:line="276" w:lineRule="auto"/>
@@ -2343,6 +2319,7 @@
     <w:name w:val="footer"/>
     <w:basedOn w:val="1"/>
     <w:link w:val="11"/>
+    <w:qFormat/>
     <w:uiPriority w:val="0"/>
     <w:pPr>
       <w:tabs>
@@ -2579,18 +2556,18 @@
 </file>
 
 <file path=customXml/item2.xml><?xml version="1.0" encoding="utf-8"?>
-<p:properties xmlns:p="http://schemas.microsoft.com/office/2006/metadata/properties" xmlns:xsi="http://www.w3.org/2001/XMLSchema-instance" xmlns:pc="http://schemas.microsoft.com/office/infopath/2007/PartnerControls">
-  <documentManagement/>
-</p:properties>
-</file>
-
-<file path=customXml/item3.xml><?xml version="1.0" encoding="utf-8"?>
 <?mso-contentType ?>
 <FormTemplates xmlns="http://schemas.microsoft.com/sharepoint/v3/contenttype/forms">
   <Display>DocumentLibraryForm</Display>
   <Edit>DocumentLibraryForm</Edit>
   <New>DocumentLibraryForm</New>
 </FormTemplates>
+</file>
+
+<file path=customXml/item3.xml><?xml version="1.0" encoding="utf-8"?>
+<p:properties xmlns:p="http://schemas.microsoft.com/office/2006/metadata/properties" xmlns:xsi="http://www.w3.org/2001/XMLSchema-instance" xmlns:pc="http://schemas.microsoft.com/office/infopath/2007/PartnerControls">
+  <documentManagement/>
+</p:properties>
 </file>
 
 <file path=customXml/item4.xml><?xml version="1.0" encoding="utf-8"?>
@@ -2716,13 +2693,13 @@
 </file>
 
 <file path=customXml/itemProps2.xml><?xml version="1.0" encoding="utf-8"?>
-<ds:datastoreItem xmlns:ds="http://schemas.openxmlformats.org/officeDocument/2006/customXml" ds:itemID="{3235D19B-92AA-40D1-A250-F0977FEF6321}">
+<ds:datastoreItem xmlns:ds="http://schemas.openxmlformats.org/officeDocument/2006/customXml" ds:itemID="{67E9B3C8-8EB5-4E4C-ADEE-70B6197AA4AD}">
   <ds:schemaRefs/>
 </ds:datastoreItem>
 </file>
 
 <file path=customXml/itemProps3.xml><?xml version="1.0" encoding="utf-8"?>
-<ds:datastoreItem xmlns:ds="http://schemas.openxmlformats.org/officeDocument/2006/customXml" ds:itemID="{67E9B3C8-8EB5-4E4C-ADEE-70B6197AA4AD}">
+<ds:datastoreItem xmlns:ds="http://schemas.openxmlformats.org/officeDocument/2006/customXml" ds:itemID="{3235D19B-92AA-40D1-A250-F0977FEF6321}">
   <ds:schemaRefs/>
 </ds:datastoreItem>
 </file>

</xml_diff>